<commit_message>
Publish site from 077b178
</commit_message>
<xml_diff>
--- a/mahnung-schreiben/letzte-mahnung-vorlage-firmendo.docx
+++ b/mahnung-schreiben/letzte-mahnung-vorlage-firmendo.docx
@@ -111,7 +111,7 @@
         <w:rPr>
           <w:b/>
         </w:rPr>
-        <w:t>Letzte Mahnung vor Einleitung des gerichtlichen Mahnverfahrens – Rechnung Nr. [2026-0142] vom [15.09.2026]</w:t>
+        <w:t>Letzte Mahnung vor Einleitung des gerichtlichen Mahnverfahrens – Rechnung Nr. [2026-0142] vom [15.10.2026]</w:t>
       </w:r>
     </w:p>
     <w:p>
@@ -133,7 +133,7 @@
         <w:rPr>
           <w:b w:val="0"/>
         </w:rPr>
-        <w:t>auf unsere Zahlungserinnerung vom [06.10.2026] und unsere Mahnung vom [17.10.2026] haben Sie nicht reagiert. Die Forderung aus der Rechnung Nr. [2026-0142] vom [15.09.2026] ist weiterhin offen.</w:t>
+        <w:t>auf unsere Zahlungserinnerung vom [06.11.2026] und unsere Mahnung vom [17.11.2026] haben Sie nicht reagiert. Die Forderung aus der Rechnung Nr. [2026-0142] vom [15.10.2026] ist weiterhin offen.</w:t>
       </w:r>
     </w:p>
     <w:p>
@@ -144,7 +144,7 @@
         <w:rPr>
           <w:b w:val="0"/>
         </w:rPr>
-        <w:t>Wir fordern Sie letztmalig auf, den nachstehenden Gesamtbetrag bis zum [05.11.2026] auf unser Konto IBAN [DE00 0000 0000 0000 0000 00] zu überweisen:</w:t>
+        <w:t>Wir fordern Sie letztmalig auf, den nachstehenden Gesamtbetrag bis zum [05.12.2026] auf unser Konto IBAN [DE00 0000 0000 0000 0000 00] zu überweisen:</w:t>
       </w:r>
     </w:p>
     <w:p>
@@ -166,7 +166,7 @@
         <w:rPr>
           <w:b w:val="0"/>
         </w:rPr>
-        <w:t>Verzugszinsen [30.09.2026 bis 27.10.2026], [28] Tage zu [10,52 %]: [9,60 €]</w:t>
+        <w:t>Verzugszinsen [30.10.2026 bis 27.11.2026], [29] Tage zu [10,52 %]: [9,95 €]</w:t>
       </w:r>
     </w:p>
     <w:p>
@@ -177,7 +177,7 @@
         <w:rPr>
           <w:b w:val="0"/>
         </w:rPr>
-        <w:t>Mahnkosten (Mahnungen vom [17.10.2026] und [heute]): [3,00 €]</w:t>
+        <w:t>Mahnkosten (Mahnungen vom [17.11.2026] und [heute]): [3,00 €]</w:t>
       </w:r>
     </w:p>
     <w:p>
@@ -199,7 +199,7 @@
         <w:rPr>
           <w:b w:val="0"/>
         </w:rPr>
-        <w:t>Gesamtforderung: [1.242,60 €]</w:t>
+        <w:t>Gesamtforderung: [1.242,95 €]</w:t>
       </w:r>
     </w:p>
     <w:p>

</xml_diff>